<commit_message>
Add BDA-IT, CCC, BMTC, KSAAD HRMS, and KEONICS scanning estimates.
Include KSAAD KSDC hosting request matrices and refresh Fraud claim/valuation artefacts plus CONTROL and feature schema.

Co-authored-by: Cursor <cursoragent@cursor.com>
</commit_message>
<xml_diff>
--- a/Projects/Fraud/ClaimManagement/CLAIM_Estimation_Summary_FeatureWise_Client.docx
+++ b/Projects/Fraud/ClaimManagement/CLAIM_Estimation_Summary_FeatureWise_Client.docx
@@ -199,7 +199,7 @@
                 <w:b w:val="0"/>
                 <w:sz w:val="20"/>
               </w:rPr>
-              <w:t>2,989</w:t>
+              <w:t>4,533</w:t>
             </w:r>
           </w:p>
         </w:tc>
@@ -281,7 +281,7 @@
                 <w:b w:val="0"/>
                 <w:sz w:val="20"/>
               </w:rPr>
-              <w:t>2,989</w:t>
+              <w:t>4,533</w:t>
             </w:r>
           </w:p>
         </w:tc>
@@ -579,7 +579,7 @@
                 <w:b w:val="0"/>
                 <w:sz w:val="20"/>
               </w:rPr>
-              <w:t>503</w:t>
+              <w:t>753</w:t>
             </w:r>
           </w:p>
         </w:tc>
@@ -598,7 +598,7 @@
                 <w:b w:val="0"/>
                 <w:sz w:val="20"/>
               </w:rPr>
-              <w:t>16.8%</w:t>
+              <w:t>16.6%</w:t>
             </w:r>
           </w:p>
         </w:tc>
@@ -680,7 +680,7 @@
                 <w:b w:val="0"/>
                 <w:sz w:val="20"/>
               </w:rPr>
-              <w:t>267</w:t>
+              <w:t>361</w:t>
             </w:r>
           </w:p>
         </w:tc>
@@ -700,7 +700,7 @@
                 <w:b w:val="0"/>
                 <w:sz w:val="20"/>
               </w:rPr>
-              <w:t>8.9%</w:t>
+              <w:t>8.0%</w:t>
             </w:r>
           </w:p>
         </w:tc>
@@ -778,7 +778,7 @@
                 <w:b w:val="0"/>
                 <w:sz w:val="20"/>
               </w:rPr>
-              <w:t>234</w:t>
+              <w:t>372</w:t>
             </w:r>
           </w:p>
         </w:tc>
@@ -797,7 +797,7 @@
                 <w:b w:val="0"/>
                 <w:sz w:val="20"/>
               </w:rPr>
-              <w:t>7.8%</w:t>
+              <w:t>8.2%</w:t>
             </w:r>
           </w:p>
         </w:tc>
@@ -879,7 +879,7 @@
                 <w:b w:val="0"/>
                 <w:sz w:val="20"/>
               </w:rPr>
-              <w:t>495</w:t>
+              <w:t>739</w:t>
             </w:r>
           </w:p>
         </w:tc>
@@ -899,7 +899,7 @@
                 <w:b w:val="0"/>
                 <w:sz w:val="20"/>
               </w:rPr>
-              <w:t>16.6%</w:t>
+              <w:t>16.3%</w:t>
             </w:r>
           </w:p>
         </w:tc>
@@ -977,7 +977,7 @@
                 <w:b w:val="0"/>
                 <w:sz w:val="20"/>
               </w:rPr>
-              <w:t>386</w:t>
+              <w:t>586</w:t>
             </w:r>
           </w:p>
         </w:tc>
@@ -1078,7 +1078,7 @@
                 <w:b w:val="0"/>
                 <w:sz w:val="20"/>
               </w:rPr>
-              <w:t>268</w:t>
+              <w:t>384</w:t>
             </w:r>
           </w:p>
         </w:tc>
@@ -1098,7 +1098,7 @@
                 <w:b w:val="0"/>
                 <w:sz w:val="20"/>
               </w:rPr>
-              <w:t>9.0%</w:t>
+              <w:t>8.5%</w:t>
             </w:r>
           </w:p>
         </w:tc>
@@ -1176,7 +1176,7 @@
                 <w:b w:val="0"/>
                 <w:sz w:val="20"/>
               </w:rPr>
-              <w:t>233</w:t>
+              <w:t>465</w:t>
             </w:r>
           </w:p>
         </w:tc>
@@ -1195,7 +1195,7 @@
                 <w:b w:val="0"/>
                 <w:sz w:val="20"/>
               </w:rPr>
-              <w:t>7.8%</w:t>
+              <w:t>10.3%</w:t>
             </w:r>
           </w:p>
         </w:tc>
@@ -1277,7 +1277,7 @@
                 <w:b w:val="0"/>
                 <w:sz w:val="20"/>
               </w:rPr>
-              <w:t>255</w:t>
+              <w:t>371</w:t>
             </w:r>
           </w:p>
         </w:tc>
@@ -1297,7 +1297,7 @@
                 <w:b w:val="0"/>
                 <w:sz w:val="20"/>
               </w:rPr>
-              <w:t>8.5%</w:t>
+              <w:t>8.2%</w:t>
             </w:r>
           </w:p>
         </w:tc>
@@ -1375,7 +1375,7 @@
                 <w:b w:val="0"/>
                 <w:sz w:val="20"/>
               </w:rPr>
-              <w:t>348</w:t>
+              <w:t>502</w:t>
             </w:r>
           </w:p>
         </w:tc>
@@ -1394,7 +1394,7 @@
                 <w:b w:val="0"/>
                 <w:sz w:val="20"/>
               </w:rPr>
-              <w:t>11.6%</w:t>
+              <w:t>11.1%</w:t>
             </w:r>
           </w:p>
         </w:tc>
@@ -1475,7 +1475,7 @@
                 <w:b w:val="0"/>
                 <w:sz w:val="20"/>
               </w:rPr>
-              <w:t>2,989</w:t>
+              <w:t>4,533</w:t>
             </w:r>
           </w:p>
         </w:tc>
@@ -1515,7 +1515,7 @@
         <w:pStyle w:val="Heading2"/>
       </w:pPr>
       <w:r>
-        <w:t>01. Access Control, Person–Post–Role &amp; Forensic Audit — 503 hours</w:t>
+        <w:t>01. Access Control, Person–Post–Role &amp; Forensic Audit — 753 hours</w:t>
       </w:r>
     </w:p>
     <w:tbl>
@@ -1678,7 +1678,7 @@
                 <w:b w:val="0"/>
                 <w:sz w:val="20"/>
               </w:rPr>
-              <w:t>45</w:t>
+              <w:t>67</w:t>
             </w:r>
           </w:p>
         </w:tc>
@@ -1759,7 +1759,7 @@
                 <w:b w:val="0"/>
                 <w:sz w:val="20"/>
               </w:rPr>
-              <w:t>78</w:t>
+              <w:t>100</w:t>
             </w:r>
           </w:p>
         </w:tc>
@@ -1838,7 +1838,7 @@
                 <w:b w:val="0"/>
                 <w:sz w:val="20"/>
               </w:rPr>
-              <w:t>61</w:t>
+              <w:t>83</w:t>
             </w:r>
           </w:p>
         </w:tc>
@@ -1919,7 +1919,7 @@
                 <w:b w:val="0"/>
                 <w:sz w:val="20"/>
               </w:rPr>
-              <w:t>32</w:t>
+              <w:t>60</w:t>
             </w:r>
           </w:p>
         </w:tc>
@@ -1998,7 +1998,7 @@
                 <w:b w:val="0"/>
                 <w:sz w:val="20"/>
               </w:rPr>
-              <w:t>43</w:t>
+              <w:t>71</w:t>
             </w:r>
           </w:p>
         </w:tc>
@@ -2079,7 +2079,7 @@
                 <w:b w:val="0"/>
                 <w:sz w:val="20"/>
               </w:rPr>
-              <w:t>70</w:t>
+              <w:t>92</w:t>
             </w:r>
           </w:p>
         </w:tc>
@@ -2158,7 +2158,7 @@
                 <w:b w:val="0"/>
                 <w:sz w:val="20"/>
               </w:rPr>
-              <w:t>41</w:t>
+              <w:t>69</w:t>
             </w:r>
           </w:p>
         </w:tc>
@@ -2239,7 +2239,7 @@
                 <w:b w:val="0"/>
                 <w:sz w:val="20"/>
               </w:rPr>
-              <w:t>39</w:t>
+              <w:t>61</w:t>
             </w:r>
           </w:p>
         </w:tc>
@@ -2318,7 +2318,7 @@
                 <w:b w:val="0"/>
                 <w:sz w:val="20"/>
               </w:rPr>
-              <w:t>32</w:t>
+              <w:t>60</w:t>
             </w:r>
           </w:p>
         </w:tc>
@@ -2399,7 +2399,7 @@
                 <w:b w:val="0"/>
                 <w:sz w:val="20"/>
               </w:rPr>
-              <w:t>62</w:t>
+              <w:t>90</w:t>
             </w:r>
           </w:p>
         </w:tc>
@@ -2431,7 +2431,7 @@
         <w:pStyle w:val="Heading2"/>
       </w:pPr>
       <w:r>
-        <w:t>02. FE Master Import (from existing application) — 267 hours</w:t>
+        <w:t>02. FE Master Import (from existing application) — 361 hours</w:t>
       </w:r>
     </w:p>
     <w:tbl>
@@ -2594,7 +2594,7 @@
                 <w:b w:val="0"/>
                 <w:sz w:val="20"/>
               </w:rPr>
-              <w:t>78</w:t>
+              <w:t>100</w:t>
             </w:r>
           </w:p>
         </w:tc>
@@ -2675,7 +2675,7 @@
                 <w:b w:val="0"/>
                 <w:sz w:val="20"/>
               </w:rPr>
-              <w:t>59</w:t>
+              <w:t>81</w:t>
             </w:r>
           </w:p>
         </w:tc>
@@ -2754,7 +2754,7 @@
                 <w:b w:val="0"/>
                 <w:sz w:val="20"/>
               </w:rPr>
-              <w:t>57</w:t>
+              <w:t>79</w:t>
             </w:r>
           </w:p>
         </w:tc>
@@ -2835,7 +2835,7 @@
                 <w:b w:val="0"/>
                 <w:sz w:val="20"/>
               </w:rPr>
-              <w:t>73</w:t>
+              <w:t>101</w:t>
             </w:r>
           </w:p>
         </w:tc>
@@ -2867,7 +2867,7 @@
         <w:pStyle w:val="Heading2"/>
       </w:pPr>
       <w:r>
-        <w:t>03. Asset Attachment &amp; Recovered Funds — 234 hours</w:t>
+        <w:t>03. Asset Attachment &amp; Recovered Funds — 372 hours</w:t>
       </w:r>
     </w:p>
     <w:tbl>
@@ -3030,7 +3030,7 @@
                 <w:b w:val="0"/>
                 <w:sz w:val="20"/>
               </w:rPr>
-              <w:t>41</w:t>
+              <w:t>63</w:t>
             </w:r>
           </w:p>
         </w:tc>
@@ -3111,7 +3111,7 @@
                 <w:b w:val="0"/>
                 <w:sz w:val="20"/>
               </w:rPr>
-              <w:t>32</w:t>
+              <w:t>60</w:t>
             </w:r>
           </w:p>
         </w:tc>
@@ -3190,7 +3190,7 @@
                 <w:b w:val="0"/>
                 <w:sz w:val="20"/>
               </w:rPr>
-              <w:t>43</w:t>
+              <w:t>71</w:t>
             </w:r>
           </w:p>
         </w:tc>
@@ -3271,7 +3271,7 @@
                 <w:b w:val="0"/>
                 <w:sz w:val="20"/>
               </w:rPr>
-              <w:t>56</w:t>
+              <w:t>78</w:t>
             </w:r>
           </w:p>
         </w:tc>
@@ -3350,7 +3350,7 @@
                 <w:b w:val="0"/>
                 <w:sz w:val="20"/>
               </w:rPr>
-              <w:t>34</w:t>
+              <w:t>50</w:t>
             </w:r>
           </w:p>
         </w:tc>
@@ -3431,7 +3431,7 @@
                 <w:b w:val="0"/>
                 <w:sz w:val="20"/>
               </w:rPr>
-              <w:t>28</w:t>
+              <w:t>50</w:t>
             </w:r>
           </w:p>
         </w:tc>
@@ -3463,7 +3463,7 @@
         <w:pStyle w:val="Heading2"/>
       </w:pPr>
       <w:r>
-        <w:t>04. Depositor Master &amp; Identity Verification — 495 hours</w:t>
+        <w:t>04. Depositor Master &amp; Identity Verification — 739 hours</w:t>
       </w:r>
     </w:p>
     <w:tbl>
@@ -3626,7 +3626,7 @@
                 <w:b w:val="0"/>
                 <w:sz w:val="20"/>
               </w:rPr>
-              <w:t>76</w:t>
+              <w:t>104</w:t>
             </w:r>
           </w:p>
         </w:tc>
@@ -3707,7 +3707,7 @@
                 <w:b w:val="0"/>
                 <w:sz w:val="20"/>
               </w:rPr>
-              <w:t>55</w:t>
+              <w:t>77</w:t>
             </w:r>
           </w:p>
         </w:tc>
@@ -3786,7 +3786,7 @@
                 <w:b w:val="0"/>
                 <w:sz w:val="20"/>
               </w:rPr>
-              <w:t>37</w:t>
+              <w:t>65</w:t>
             </w:r>
           </w:p>
         </w:tc>
@@ -3867,7 +3867,7 @@
                 <w:b w:val="0"/>
                 <w:sz w:val="20"/>
               </w:rPr>
-              <w:t>30</w:t>
+              <w:t>58</w:t>
             </w:r>
           </w:p>
         </w:tc>
@@ -3946,7 +3946,7 @@
                 <w:b w:val="0"/>
                 <w:sz w:val="20"/>
               </w:rPr>
-              <w:t>35</w:t>
+              <w:t>63</w:t>
             </w:r>
           </w:p>
         </w:tc>
@@ -4027,7 +4027,7 @@
                 <w:b w:val="0"/>
                 <w:sz w:val="20"/>
               </w:rPr>
-              <w:t>49</w:t>
+              <w:t>71</w:t>
             </w:r>
           </w:p>
         </w:tc>
@@ -4106,7 +4106,7 @@
                 <w:b w:val="0"/>
                 <w:sz w:val="20"/>
               </w:rPr>
-              <w:t>51</w:t>
+              <w:t>79</w:t>
             </w:r>
           </w:p>
         </w:tc>
@@ -4187,7 +4187,7 @@
                 <w:b w:val="0"/>
                 <w:sz w:val="20"/>
               </w:rPr>
-              <w:t>66</w:t>
+              <w:t>88</w:t>
             </w:r>
           </w:p>
         </w:tc>
@@ -4266,7 +4266,7 @@
                 <w:b w:val="0"/>
                 <w:sz w:val="20"/>
               </w:rPr>
-              <w:t>62</w:t>
+              <w:t>84</w:t>
             </w:r>
           </w:p>
         </w:tc>
@@ -4347,7 +4347,7 @@
                 <w:b w:val="0"/>
                 <w:sz w:val="20"/>
               </w:rPr>
-              <w:t>34</w:t>
+              <w:t>50</w:t>
             </w:r>
           </w:p>
         </w:tc>
@@ -4379,7 +4379,7 @@
         <w:pStyle w:val="Heading2"/>
       </w:pPr>
       <w:r>
-        <w:t>05. Investment Portfolio Management — 386 hours</w:t>
+        <w:t>05. Investment Portfolio Management — 586 hours</w:t>
       </w:r>
     </w:p>
     <w:tbl>
@@ -4542,7 +4542,7 @@
                 <w:b w:val="0"/>
                 <w:sz w:val="20"/>
               </w:rPr>
-              <w:t>43</w:t>
+              <w:t>59</w:t>
             </w:r>
           </w:p>
         </w:tc>
@@ -4623,7 +4623,7 @@
                 <w:b w:val="0"/>
                 <w:sz w:val="20"/>
               </w:rPr>
-              <w:t>44</w:t>
+              <w:t>66</w:t>
             </w:r>
           </w:p>
         </w:tc>
@@ -4702,7 +4702,7 @@
                 <w:b w:val="0"/>
                 <w:sz w:val="20"/>
               </w:rPr>
-              <w:t>39</w:t>
+              <w:t>67</w:t>
             </w:r>
           </w:p>
         </w:tc>
@@ -4783,7 +4783,7 @@
                 <w:b w:val="0"/>
                 <w:sz w:val="20"/>
               </w:rPr>
-              <w:t>43</w:t>
+              <w:t>71</w:t>
             </w:r>
           </w:p>
         </w:tc>
@@ -4862,7 +4862,7 @@
                 <w:b w:val="0"/>
                 <w:sz w:val="20"/>
               </w:rPr>
-              <w:t>66</w:t>
+              <w:t>88</w:t>
             </w:r>
           </w:p>
         </w:tc>
@@ -4943,7 +4943,7 @@
                 <w:b w:val="0"/>
                 <w:sz w:val="20"/>
               </w:rPr>
-              <w:t>32</w:t>
+              <w:t>60</w:t>
             </w:r>
           </w:p>
         </w:tc>
@@ -5022,7 +5022,7 @@
                 <w:b w:val="0"/>
                 <w:sz w:val="20"/>
               </w:rPr>
-              <w:t>76</w:t>
+              <w:t>104</w:t>
             </w:r>
           </w:p>
         </w:tc>
@@ -5103,7 +5103,7 @@
                 <w:b w:val="0"/>
                 <w:sz w:val="20"/>
               </w:rPr>
-              <w:t>43</w:t>
+              <w:t>71</w:t>
             </w:r>
           </w:p>
         </w:tc>
@@ -5135,7 +5135,7 @@
         <w:pStyle w:val="Heading2"/>
       </w:pPr>
       <w:r>
-        <w:t>06. Claim Notification &amp; Intake — 268 hours</w:t>
+        <w:t>06. Claim Notification &amp; Intake — 384 hours</w:t>
       </w:r>
     </w:p>
     <w:tbl>
@@ -5298,7 +5298,7 @@
                 <w:b w:val="0"/>
                 <w:sz w:val="20"/>
               </w:rPr>
-              <w:t>41</w:t>
+              <w:t>63</w:t>
             </w:r>
           </w:p>
         </w:tc>
@@ -5379,7 +5379,7 @@
                 <w:b w:val="0"/>
                 <w:sz w:val="20"/>
               </w:rPr>
-              <w:t>66</w:t>
+              <w:t>88</w:t>
             </w:r>
           </w:p>
         </w:tc>
@@ -5458,7 +5458,7 @@
                 <w:b w:val="0"/>
                 <w:sz w:val="20"/>
               </w:rPr>
-              <w:t>60</w:t>
+              <w:t>82</w:t>
             </w:r>
           </w:p>
         </w:tc>
@@ -5539,7 +5539,7 @@
                 <w:b w:val="0"/>
                 <w:sz w:val="20"/>
               </w:rPr>
-              <w:t>56</w:t>
+              <w:t>78</w:t>
             </w:r>
           </w:p>
         </w:tc>
@@ -5618,7 +5618,7 @@
                 <w:b w:val="0"/>
                 <w:sz w:val="20"/>
               </w:rPr>
-              <w:t>45</w:t>
+              <w:t>73</w:t>
             </w:r>
           </w:p>
         </w:tc>
@@ -5649,7 +5649,7 @@
         <w:pStyle w:val="Heading2"/>
       </w:pPr>
       <w:r>
-        <w:t>07. Claim Verification, Evaluation &amp; Approval — 233 hours</w:t>
+        <w:t>07. Claim Verification, Evaluation &amp; Approval — 465 hours</w:t>
       </w:r>
     </w:p>
     <w:tbl>
@@ -5812,7 +5812,7 @@
                 <w:b w:val="0"/>
                 <w:sz w:val="20"/>
               </w:rPr>
-              <w:t>46</w:t>
+              <w:t>74</w:t>
             </w:r>
           </w:p>
         </w:tc>
@@ -5893,7 +5893,7 @@
                 <w:b w:val="0"/>
                 <w:sz w:val="20"/>
               </w:rPr>
-              <w:t>49</w:t>
+              <w:t>71</w:t>
             </w:r>
           </w:p>
         </w:tc>
@@ -5972,7 +5972,7 @@
                 <w:b w:val="0"/>
                 <w:sz w:val="20"/>
               </w:rPr>
-              <w:t>52</w:t>
+              <w:t>74</w:t>
             </w:r>
           </w:p>
         </w:tc>
@@ -6053,7 +6053,7 @@
                 <w:b w:val="0"/>
                 <w:sz w:val="20"/>
               </w:rPr>
-              <w:t>39</w:t>
+              <w:t>119</w:t>
             </w:r>
           </w:p>
         </w:tc>
@@ -6132,7 +6132,7 @@
                 <w:b w:val="0"/>
                 <w:sz w:val="20"/>
               </w:rPr>
-              <w:t>47</w:t>
+              <w:t>127</w:t>
             </w:r>
           </w:p>
         </w:tc>
@@ -6163,7 +6163,7 @@
         <w:pStyle w:val="Heading2"/>
       </w:pPr>
       <w:r>
-        <w:t>08. Settlement, Payment &amp; Closure — 255 hours</w:t>
+        <w:t>08. Settlement, Payment &amp; Closure — 371 hours</w:t>
       </w:r>
     </w:p>
     <w:tbl>
@@ -6326,7 +6326,7 @@
                 <w:b w:val="0"/>
                 <w:sz w:val="20"/>
               </w:rPr>
-              <w:t>56</w:t>
+              <w:t>78</w:t>
             </w:r>
           </w:p>
         </w:tc>
@@ -6407,7 +6407,7 @@
                 <w:b w:val="0"/>
                 <w:sz w:val="20"/>
               </w:rPr>
-              <w:t>60</w:t>
+              <w:t>82</w:t>
             </w:r>
           </w:p>
         </w:tc>
@@ -6486,7 +6486,7 @@
                 <w:b w:val="0"/>
                 <w:sz w:val="20"/>
               </w:rPr>
-              <w:t>57</w:t>
+              <w:t>79</w:t>
             </w:r>
           </w:p>
         </w:tc>
@@ -6567,7 +6567,7 @@
                 <w:b w:val="0"/>
                 <w:sz w:val="20"/>
               </w:rPr>
-              <w:t>43</w:t>
+              <w:t>65</w:t>
             </w:r>
           </w:p>
         </w:tc>
@@ -6646,7 +6646,7 @@
                 <w:b w:val="0"/>
                 <w:sz w:val="20"/>
               </w:rPr>
-              <w:t>39</w:t>
+              <w:t>67</w:t>
             </w:r>
           </w:p>
         </w:tc>
@@ -6677,7 +6677,7 @@
         <w:pStyle w:val="Heading2"/>
       </w:pPr>
       <w:r>
-        <w:t>09. Operational Reports, Lists &amp; Special Court Outputs — 348 hours</w:t>
+        <w:t>09. Operational Reports, Lists &amp; Special Court Outputs — 502 hours</w:t>
       </w:r>
     </w:p>
     <w:tbl>
@@ -6840,7 +6840,7 @@
                 <w:b w:val="0"/>
                 <w:sz w:val="20"/>
               </w:rPr>
-              <w:t>50</w:t>
+              <w:t>72</w:t>
             </w:r>
           </w:p>
         </w:tc>
@@ -6921,7 +6921,7 @@
                 <w:b w:val="0"/>
                 <w:sz w:val="20"/>
               </w:rPr>
-              <w:t>48</w:t>
+              <w:t>70</w:t>
             </w:r>
           </w:p>
         </w:tc>
@@ -7000,7 +7000,7 @@
                 <w:b w:val="0"/>
                 <w:sz w:val="20"/>
               </w:rPr>
-              <w:t>41</w:t>
+              <w:t>63</w:t>
             </w:r>
           </w:p>
         </w:tc>
@@ -7081,7 +7081,7 @@
                 <w:b w:val="0"/>
                 <w:sz w:val="20"/>
               </w:rPr>
-              <w:t>53</w:t>
+              <w:t>81</w:t>
             </w:r>
           </w:p>
         </w:tc>
@@ -7160,7 +7160,7 @@
                 <w:b w:val="0"/>
                 <w:sz w:val="20"/>
               </w:rPr>
-              <w:t>64</w:t>
+              <w:t>86</w:t>
             </w:r>
           </w:p>
         </w:tc>
@@ -7241,7 +7241,7 @@
                 <w:b w:val="0"/>
                 <w:sz w:val="20"/>
               </w:rPr>
-              <w:t>56</w:t>
+              <w:t>78</w:t>
             </w:r>
           </w:p>
         </w:tc>
@@ -7320,7 +7320,7 @@
                 <w:b w:val="0"/>
                 <w:sz w:val="20"/>
               </w:rPr>
-              <w:t>36</w:t>
+              <w:t>52</w:t>
             </w:r>
           </w:p>
         </w:tc>
@@ -7451,7 +7451,7 @@
                 <w:b w:val="0"/>
                 <w:sz w:val="20"/>
               </w:rPr>
-              <w:t>503</w:t>
+              <w:t>753</w:t>
             </w:r>
           </w:p>
         </w:tc>
@@ -7493,7 +7493,7 @@
                 <w:b w:val="0"/>
                 <w:sz w:val="20"/>
               </w:rPr>
-              <w:t>2,486</w:t>
+              <w:t>3,780</w:t>
             </w:r>
           </w:p>
         </w:tc>
@@ -7533,7 +7533,7 @@
                 <w:b w:val="0"/>
                 <w:sz w:val="20"/>
               </w:rPr>
-              <w:t>2,989</w:t>
+              <w:t>4,533</w:t>
             </w:r>
           </w:p>
         </w:tc>
@@ -7651,7 +7651,7 @@
                 <w:b w:val="0"/>
                 <w:sz w:val="20"/>
               </w:rPr>
-              <w:t>F02-001</w:t>
+              <w:t>F07-005</w:t>
             </w:r>
           </w:p>
         </w:tc>
@@ -7670,7 +7670,7 @@
                 <w:b w:val="0"/>
                 <w:sz w:val="20"/>
               </w:rPr>
-              <w:t>Import FE details</w:t>
+              <w:t>Claim approval decisions</w:t>
             </w:r>
           </w:p>
         </w:tc>
@@ -7689,7 +7689,7 @@
                 <w:b w:val="0"/>
                 <w:sz w:val="20"/>
               </w:rPr>
-              <w:t>78</w:t>
+              <w:t>127</w:t>
             </w:r>
           </w:p>
         </w:tc>
@@ -7711,7 +7711,7 @@
                 <w:b w:val="0"/>
                 <w:sz w:val="20"/>
               </w:rPr>
-              <w:t>F01-002</w:t>
+              <w:t>F07-004</w:t>
             </w:r>
           </w:p>
         </w:tc>
@@ -7731,7 +7731,7 @@
                 <w:b w:val="0"/>
                 <w:sz w:val="20"/>
               </w:rPr>
-              <w:t>Post, Role-to-Post and Post-to-Person mapping</w:t>
+              <w:t>Verification report for Competent Authority</w:t>
             </w:r>
           </w:p>
         </w:tc>
@@ -7751,7 +7751,7 @@
                 <w:b w:val="0"/>
                 <w:sz w:val="20"/>
               </w:rPr>
-              <w:t>78</w:t>
+              <w:t>119</w:t>
             </w:r>
           </w:p>
         </w:tc>
@@ -7810,7 +7810,7 @@
                 <w:b w:val="0"/>
                 <w:sz w:val="20"/>
               </w:rPr>
-              <w:t>76</w:t>
+              <w:t>104</w:t>
             </w:r>
           </w:p>
         </w:tc>
@@ -7872,7 +7872,7 @@
                 <w:b w:val="0"/>
                 <w:sz w:val="20"/>
               </w:rPr>
-              <w:t>76</w:t>
+              <w:t>104</w:t>
             </w:r>
           </w:p>
         </w:tc>
@@ -7931,7 +7931,7 @@
                 <w:b w:val="0"/>
                 <w:sz w:val="20"/>
               </w:rPr>
-              <w:t>73</w:t>
+              <w:t>101</w:t>
             </w:r>
           </w:p>
         </w:tc>
@@ -7953,7 +7953,7 @@
                 <w:b w:val="0"/>
                 <w:sz w:val="20"/>
               </w:rPr>
-              <w:t>F01-006</w:t>
+              <w:t>F02-001</w:t>
             </w:r>
           </w:p>
         </w:tc>
@@ -7973,7 +7973,7 @@
                 <w:b w:val="0"/>
                 <w:sz w:val="20"/>
               </w:rPr>
-              <w:t>Two-Factor Authentication (staff)</w:t>
+              <w:t>Import FE details</w:t>
             </w:r>
           </w:p>
         </w:tc>
@@ -7993,7 +7993,7 @@
                 <w:b w:val="0"/>
                 <w:sz w:val="20"/>
               </w:rPr>
-              <w:t>70</w:t>
+              <w:t>100</w:t>
             </w:r>
           </w:p>
         </w:tc>
@@ -8014,7 +8014,7 @@
                 <w:b w:val="0"/>
                 <w:sz w:val="20"/>
               </w:rPr>
-              <w:t>F06-002</w:t>
+              <w:t>F01-002</w:t>
             </w:r>
           </w:p>
         </w:tc>
@@ -8033,7 +8033,7 @@
                 <w:b w:val="0"/>
                 <w:sz w:val="20"/>
               </w:rPr>
-              <w:t>Staff-mediated claim intake (in-Karnataka)</w:t>
+              <w:t>Post, Role-to-Post and Post-to-Person mapping</w:t>
             </w:r>
           </w:p>
         </w:tc>
@@ -8052,7 +8052,7 @@
                 <w:b w:val="0"/>
                 <w:sz w:val="20"/>
               </w:rPr>
-              <w:t>66</w:t>
+              <w:t>100</w:t>
             </w:r>
           </w:p>
         </w:tc>
@@ -8074,7 +8074,7 @@
                 <w:b w:val="0"/>
                 <w:sz w:val="20"/>
               </w:rPr>
-              <w:t>F05-005</w:t>
+              <w:t>F01-006</w:t>
             </w:r>
           </w:p>
         </w:tc>
@@ -8094,7 +8094,7 @@
                 <w:b w:val="0"/>
                 <w:sz w:val="20"/>
               </w:rPr>
-              <w:t>Bank returns analysis and claim cross-check</w:t>
+              <w:t>Two-Factor Authentication (staff)</w:t>
             </w:r>
           </w:p>
         </w:tc>
@@ -8114,7 +8114,7 @@
                 <w:b w:val="0"/>
                 <w:sz w:val="20"/>
               </w:rPr>
-              <w:t>66</w:t>
+              <w:t>92</w:t>
             </w:r>
           </w:p>
         </w:tc>

</xml_diff>